<commit_message>
docs(remote): annotate October 28 PRD changes
</commit_message>
<xml_diff>
--- a/public/streaming-mvp/盖世远程PRD-V4.11-Word图片内嵌版.docx
+++ b/public/streaming-mvp/盖世远程PRD-V4.11-Word图片内嵌版.docx
@@ -58,7 +58,7 @@
           <w:b w:val="0"/>
           <w:i w:val="0"/>
         </w:rPr>
-        <w:t xml:space="preserve"> 图片引用用于本地阅读版。导入飞书请使用同目录的《盖世远程PRD-V4.11-Word图片内嵌版.docx》，本轮由该Word内嵌图片（当前待统一构建）；直接导入本 Markdown 时，飞书不会自动携带本地图片文件。</w:t>
+        <w:t xml:space="preserve"> 图片引用用于本地阅读版。导入飞书请使用同目录的《盖世远程PRD-V4.11-Word图片内嵌版.docx》，42张图片已内嵌到该Word；直接导入本 Markdown 时，飞书不会自动携带本地图片文件。</w:t>
       </w:r>
       <w:r>
         <w:rPr>
@@ -1722,6 +1722,131 @@
           </w:p>
         </w:tc>
       </w:tr>
+      <w:tr>
+        <w:trPr>
+          <w:cantSplit/>
+        </w:trPr>
+        <w:tc>
+          <w:tcPr>
+            <w:tcW w:type="dxa" w:w="2592"/>
+            <w:vAlign w:val="top"/>
+            <w:tcMar>
+              <w:top w:w="80" w:type="dxa"/>
+              <w:start w:w="100" w:type="dxa"/>
+              <w:bottom w:w="80" w:type="dxa"/>
+              <w:end w:w="100" w:type="dxa"/>
+            </w:tcMar>
+          </w:tcPr>
+          <w:p>
+            <w:pPr>
+              <w:spacing w:after="40"/>
+            </w:pPr>
+            <w:r>
+              <w:rPr>
+                <w:rFonts w:ascii="Microsoft YaHei" w:hAnsi="Microsoft YaHei" w:eastAsia="Microsoft YaHei"/>
+              </w:rPr>
+            </w:r>
+            <w:r>
+              <w:rPr>
+                <w:rFonts w:ascii="Microsoft YaHei" w:hAnsi="Microsoft YaHei" w:eastAsia="Microsoft YaHei"/>
+                <w:b w:val="0"/>
+                <w:i w:val="0"/>
+              </w:rPr>
+              <w:t>2026/10/28</w:t>
+            </w:r>
+          </w:p>
+        </w:tc>
+        <w:tc>
+          <w:tcPr>
+            <w:tcW w:type="dxa" w:w="2592"/>
+            <w:vAlign w:val="top"/>
+            <w:tcMar>
+              <w:top w:w="80" w:type="dxa"/>
+              <w:start w:w="100" w:type="dxa"/>
+              <w:bottom w:w="80" w:type="dxa"/>
+              <w:end w:w="100" w:type="dxa"/>
+            </w:tcMar>
+          </w:tcPr>
+          <w:p>
+            <w:pPr>
+              <w:spacing w:after="40"/>
+            </w:pPr>
+            <w:r>
+              <w:rPr>
+                <w:rFonts w:ascii="Microsoft YaHei" w:hAnsi="Microsoft YaHei" w:eastAsia="Microsoft YaHei"/>
+              </w:rPr>
+            </w:r>
+            <w:r>
+              <w:rPr>
+                <w:rFonts w:ascii="Microsoft YaHei" w:hAnsi="Microsoft YaHei" w:eastAsia="Microsoft YaHei"/>
+                <w:b w:val="0"/>
+                <w:i w:val="0"/>
+              </w:rPr>
+              <w:t>为当天相对V4.7的修改规则补充行末日期标注，涵盖V4.8至V4.11最终有效内容；业务规则不变</w:t>
+            </w:r>
+          </w:p>
+        </w:tc>
+        <w:tc>
+          <w:tcPr>
+            <w:tcW w:type="dxa" w:w="2592"/>
+            <w:vAlign w:val="top"/>
+            <w:tcMar>
+              <w:top w:w="80" w:type="dxa"/>
+              <w:start w:w="100" w:type="dxa"/>
+              <w:bottom w:w="80" w:type="dxa"/>
+              <w:end w:w="100" w:type="dxa"/>
+            </w:tcMar>
+          </w:tcPr>
+          <w:p>
+            <w:pPr>
+              <w:spacing w:after="40"/>
+            </w:pPr>
+            <w:r>
+              <w:rPr>
+                <w:rFonts w:ascii="Microsoft YaHei" w:hAnsi="Microsoft YaHei" w:eastAsia="Microsoft YaHei"/>
+              </w:rPr>
+            </w:r>
+            <w:r>
+              <w:rPr>
+                <w:rFonts w:ascii="Microsoft YaHei" w:hAnsi="Microsoft YaHei" w:eastAsia="Microsoft YaHei"/>
+                <w:b w:val="0"/>
+                <w:i w:val="0"/>
+              </w:rPr>
+              <w:t>V4.11-Draft（标注补充）</w:t>
+            </w:r>
+          </w:p>
+        </w:tc>
+        <w:tc>
+          <w:tcPr>
+            <w:tcW w:type="dxa" w:w="2592"/>
+            <w:vAlign w:val="top"/>
+            <w:tcMar>
+              <w:top w:w="80" w:type="dxa"/>
+              <w:start w:w="100" w:type="dxa"/>
+              <w:bottom w:w="80" w:type="dxa"/>
+              <w:end w:w="100" w:type="dxa"/>
+            </w:tcMar>
+          </w:tcPr>
+          <w:p>
+            <w:pPr>
+              <w:spacing w:after="40"/>
+            </w:pPr>
+            <w:r>
+              <w:rPr>
+                <w:rFonts w:ascii="Microsoft YaHei" w:hAnsi="Microsoft YaHei" w:eastAsia="Microsoft YaHei"/>
+              </w:rPr>
+            </w:r>
+            <w:r>
+              <w:rPr>
+                <w:rFonts w:ascii="Microsoft YaHei" w:hAnsi="Microsoft YaHei" w:eastAsia="Microsoft YaHei"/>
+                <w:b w:val="0"/>
+                <w:i w:val="0"/>
+              </w:rPr>
+              <w:t>产品</w:t>
+            </w:r>
+          </w:p>
+        </w:tc>
+      </w:tr>
     </w:tbl>
     <w:p>
       <w:pPr>
@@ -1737,7 +1862,7 @@
           <w:b w:val="0"/>
           <w:i w:val="0"/>
         </w:rPr>
-        <w:t>备注：搜2026.10.28复用交互（线框可点击）；搜2026.10.28复用占位（按键与布局线框）；搜2026.10.28二次评审（公网、UID、注销、双App扫码、语言包与按键云分享）；搜2026.10.28修改（中文/English切换、模拟登录示例与我的页布局）；搜2026.10.26修改（两Tab、我的、扫一扫、更新通知、昵称旁退出图标、退出二次确认、未勾协议可操作及电脑默认登录）。本稿替代 V3.10 中的游戏库入口、盖世 Mac 侧栏、默认沿用盖世登录态及首次安装引导。工作名为“盖世远程”。本期为 MVP，保留现有 Demo 远控能力，补登录、登录协议、电脑端新手引导、我的与帮助入口。国内手机号验证码、海外邮箱验证码/Google、电脑端扫码已确认；移动端保留盖世游戏 App 拉起登录，并在我的Tab提供扫一扫，用于扫描电脑端登录码，不展示供本机扫描的二维码。配图为本地 Demo，不代表登录服务或远控引擎已经接通。</w:t>
+        <w:t>备注：搜索“/2026.10.28修改”定位当天变更规则，标注位于对应说明结尾，覆盖中英评审切换、我的页布局、二次评审及按键与布局交互；搜2026.10.26修改（两Tab、我的、扫一扫、更新通知、昵称旁退出图标、退出二次确认、未勾协议可操作及电脑默认登录）。本稿替代 V3.10 中的游戏库入口、盖世 Mac 侧栏、默认沿用盖世登录态及首次安装引导。工作名为“盖世远程”。本期为 MVP，保留现有 Demo 远控能力，补登录、登录协议、电脑端新手引导、我的与帮助入口。国内手机号验证码、海外邮箱验证码/Google、电脑端扫码已确认；移动端保留盖世游戏 App 拉起登录，并在我的Tab提供扫一扫，用于扫描电脑端登录码，不展示供本机扫描的二维码。配图为本地 Demo，不代表登录服务或远控引擎已经接通。</w:t>
       </w:r>
     </w:p>
     <w:p>
@@ -1926,7 +2051,7 @@
                 <w:b w:val="0"/>
                 <w:i w:val="0"/>
               </w:rPr>
-              <w:t>独立移动App及Windows/Mac电脑客户端。设备列表等普通页面首期采用竖屏，不设横竖屏切换入口；仅进入游戏且游戏已启动的远控会话保留横屏适配与虚拟按键，其余页面保持竖屏。折叠屏等专门适配后续处理；精确系统版本和处理器架构待确认，Mac Demo不代替Windows实机验收。</w:t>
+              <w:t>独立移动App及Windows/Mac电脑客户端。设备列表等普通页面首期采用竖屏，不设横竖屏切换入口；仅进入游戏且游戏已启动的远控会话保留横屏适配与虚拟按键，其余页面保持竖屏。折叠屏等专门适配后续处理；精确系统版本和处理器架构待确认，Mac Demo不代替Windows实机验收。 /2026.10.28修改</w:t>
             </w:r>
           </w:p>
         </w:tc>
@@ -1991,7 +2116,7 @@
                 <w:b w:val="0"/>
                 <w:i w:val="0"/>
               </w:rPr>
-              <w:t>现有 Demo 的同账号电脑列表、详情、本机被控设置、连接与退出，以及既有观看、输入、文件、电源、快捷启动；本轮补登录、协议同意、电脑端登录后首次使用引导、移动端我的及双端帮助、版本和关于入口。两端统一浅色模式，不提供黑夜模式。国内手机号验证码+盖世授权，海外邮箱验证码+Google+盖世授权；移动端拉起盖世游戏 App 或从我的Tab扫一扫，电脑端展示登录二维码。一期同时覆盖局域网与公网远程自己的电脑；公网连接方案与资源限制待确认，不新增远程协助或收费流程。</w:t>
+              <w:t>现有 Demo 的同账号电脑列表、详情、本机被控设置、连接与退出，以及既有观看、输入、文件、电源、快捷启动；本轮补登录、协议同意、电脑端登录后首次使用引导、移动端我的及双端帮助、版本和关于入口。两端统一浅色模式，不提供黑夜模式。国内手机号验证码+盖世授权，海外邮箱验证码+Google+盖世授权；移动端拉起盖世游戏 App 或从我的Tab扫一扫，电脑端展示登录二维码。一期同时覆盖局域网与公网远程自己的电脑；公网连接方案与资源限制待确认，不新增远程协助或收费流程。 /2026.10.28修改</w:t>
             </w:r>
           </w:p>
         </w:tc>
@@ -2121,7 +2246,7 @@
                 <w:b w:val="0"/>
                 <w:i w:val="0"/>
               </w:rPr>
-              <w:t>一期不新增文章/协议运营配置页面及商业化入口；独立产品的更新和后续配置需与盖世游戏区分，后台账号权限可复用。地区由对应发行版本/账号配置确定；Demo的地区切换仅位于评审工具。Demo顶部常驻“中文”“English”按钮属于外部评审控件，只切换界面语言，不切换国内/海外，不新增正式语言或地区设置页。正式产品一期中英文随官网下载包提供，安装后不设语言切换入口；官网应露出盖世远程的移动与电脑下载入口，语言对应安装包。正式品牌、各平台包地址及协议内容需接入。</w:t>
+              <w:t>一期不新增文章/协议运营配置页面及商业化入口；独立产品的更新和后续配置需与盖世游戏区分，后台账号权限可复用。地区由对应发行版本/账号配置确定；Demo的地区切换仅位于评审工具。Demo顶部常驻“中文”“English”按钮属于外部评审控件，只切换界面语言，不切换国内/海外，不新增正式语言或地区设置页。正式产品一期中英文随官网下载包提供，安装后不设语言切换入口；官网应露出盖世远程的移动与电脑下载入口，语言对应安装包。正式品牌、各平台包地址及协议内容需接入。 /2026.10.28修改</w:t>
             </w:r>
           </w:p>
         </w:tc>
@@ -2186,7 +2311,7 @@
                 <w:b w:val="0"/>
                 <w:i w:val="0"/>
               </w:rPr>
-              <w:t>产品与设计确认页面和规则；移动/电脑客户端承接登录、设备与远控交互，账号服务提供盖世身份、独立会话与授权，设备/远控服务处理设备状态与会话；测试按端和地区核对，数据核对事件及历史映射。服务端承接静态H5、账号与独立更新配置，客户端提供H5打开与返回能力；一期不新增内容配置页面。</w:t>
+              <w:t>产品与设计确认页面和规则；移动/电脑客户端承接登录、设备与远控交互，账号服务提供盖世身份、独立会话与授权，设备/远控服务处理设备状态与会话；测试按端和地区核对，数据核对事件及历史映射。服务端承接静态H5、账号与独立更新配置，客户端提供H5打开与返回能力；一期不新增内容配置页面。 /2026.10.28修改</w:t>
             </w:r>
           </w:p>
         </w:tc>
@@ -2910,7 +3035,7 @@
                 <w:b w:val="0"/>
                 <w:i w:val="0"/>
               </w:rPr>
-              <w:t>手机或另一台电脑作为主控，在家、公司或其他网络连接自己的电脑；支持局域网与公网，目标电脑完成独立客户端登录及被控权限。</w:t>
+              <w:t>手机或另一台电脑作为主控，在家、公司或其他网络连接自己的电脑；支持局域网与公网，目标电脑完成独立客户端登录及被控权限。 /2026.10.28修改</w:t>
             </w:r>
           </w:p>
         </w:tc>
@@ -2975,7 +3100,7 @@
                 <w:b w:val="0"/>
                 <w:i w:val="0"/>
               </w:rPr>
-              <w:t>地区登录和授权衔接同账号设备、详情及远控；移动端底部为我的设备/我的，扫一扫、帮助中心、检查更新、关于集中在我的，退出位于昵称右侧；电脑更多下拉承接教程、帮助、原页检查更新及关于；退出位于账户面板昵称右侧，设置保留左侧入口。双端采用浅色模式，远控沿用当前Demo的输入、观看、文件、电源与快捷启动；移动端按键与布局复用盖世已有模块，本Demo保留用户截图主页结构，以可操作线框演示既有模块交互，不另建独立三Tab主页或另一套布局业务规则。</w:t>
+              <w:t>地区登录和授权衔接同账号设备、详情及远控；移动端底部为我的设备/我的，扫一扫、帮助中心、检查更新、关于集中在我的，退出位于昵称右侧；电脑更多下拉承接教程、帮助、原页检查更新及关于；退出位于账户面板昵称右侧，设置保留左侧入口。双端采用浅色模式，远控沿用当前Demo的输入、观看、文件、电源与快捷启动；移动端按键与布局复用盖世已有模块，本Demo保留用户截图主页结构，以可操作线框演示既有模块交互，不另建独立三Tab主页或另一套布局业务规则。 /2026.10.28修改</w:t>
             </w:r>
           </w:p>
         </w:tc>
@@ -3633,7 +3758,7 @@
                 <w:b w:val="0"/>
                 <w:i w:val="0"/>
               </w:rPr>
-              <w:t>1. 产品登录页品牌区只显示盖世游戏 Logo 和“盖世远程”，删除电脑插画、宣传标题/副文案，不显示原游戏、社区、游戏库底部栏。</w:t>
+              <w:t>1. 产品登录页品牌区只显示盖世游戏 Logo 和“盖世远程”，删除电脑插画、宣传标题/副文案，不显示原游戏、社区、游戏库底部栏。 /2026.10.28修改</w:t>
             </w:r>
             <w:r>
               <w:rPr>
@@ -3717,7 +3842,7 @@
                 <w:b w:val="0"/>
                 <w:i w:val="0"/>
               </w:rPr>
-              <w:t>3. 勾选同意后保留本次输入和仍有效的验证码，无需因勾选重新发码；点击“登录”校验本次验证码及协议，首次使用且无既有账号时按盖世账号体系完成登录即注册，不新增独立注册页；取得并核实有效会话后获取当前盖世UID设备。已同意时点击App/Google入口进入本次授权；异步成功前再次核对本次同意及尝试仍有效。</w:t>
+              <w:t>3. 勾选同意后保留本次输入和仍有效的验证码，无需因勾选重新发码；点击“登录”校验本次验证码及协议，首次使用且无既有账号时按盖世账号体系完成登录即注册，不新增独立注册页；取得并核实有效会话后获取当前盖世UID设备。已同意时点击App/Google入口进入本次授权；异步成功前再次核对本次同意及尝试仍有效。 /2026.10.28修改</w:t>
             </w:r>
             <w:r>
               <w:rPr>
@@ -3889,7 +4014,7 @@
                 <w:b w:val="0"/>
                 <w:i w:val="0"/>
               </w:rPr>
-              <w:t>3. 统一演示示例：国内手机号13600008000，海外邮箱player@example.com，验证码123456。填写对应地区账号→点击获取验证码→填写验证码→勾选协议→点击登录；这是推荐演示顺序，未勾选时可获取验证码的规则不变。手机号/邮箱只需符合当前格式校验，不设示例账号白名单，不发送短信或邮件。254字符等为演示限制，正式国家码、长度、邮箱大小写、注册判断、发送间隔和有效期需与盖世账号组件核对。</w:t>
+              <w:t>3. 统一演示示例：国内手机号13600008000，海外邮箱player@example.com，验证码123456。填写对应地区账号→点击获取验证码→填写验证码→勾选协议→点击登录；这是推荐演示顺序，未勾选时可获取验证码的规则不变。手机号/邮箱只需符合当前格式校验，不设示例账号白名单，不发送短信或邮件。254字符等为演示限制，正式国家码、长度、邮箱大小写、注册判断、发送间隔和有效期需与盖世账号组件核对。 /2026.10.28修改</w:t>
             </w:r>
             <w:r>
               <w:rPr>
@@ -4445,7 +4570,7 @@
                 <w:b w:val="0"/>
                 <w:i w:val="0"/>
               </w:rPr>
-              <w:t>1. 盖世App版本支持且已登录时确认本次授权；未登录/失效时先完成盖世原登录/注册，再继续仍有效授权。本期仅支持从盖世远程拉起盖世游戏授权，不新增反向授权入口。</w:t>
+              <w:t>1. 盖世App版本支持且已登录时确认本次授权；未登录/失效时先完成盖世原登录/注册，再继续仍有效授权。本期仅支持从盖世远程拉起盖世游戏授权，不新增反向授权入口。 /2026.10.28修改</w:t>
             </w:r>
             <w:r>
               <w:rPr>
@@ -4617,7 +4742,7 @@
                 <w:b w:val="0"/>
                 <w:i w:val="0"/>
               </w:rPr>
-              <w:t>2. 未安装/无法拉起时留在登录页；国内可用手机号，海外可用邮箱/Google，不跳虚构下载地址。已安装但盖世版本不支持本次授权时，提示先更新盖世游戏，不进入授权或完成登录；更新完成后用户重新发起本次授权，不复用失效请求。最低支持版本及更新地址待接入，不编造版本号。</w:t>
+              <w:t>2. 未安装/无法拉起时留在登录页；国内可用手机号，海外可用邮箱/Google，不跳虚构下载地址。已安装但盖世版本不支持本次授权时，提示先更新盖世游戏，不进入授权或完成登录；更新完成后用户重新发起本次授权，不复用失效请求。最低支持版本及更新地址待接入，不编造版本号。 /2026.10.28修改</w:t>
             </w:r>
             <w:r>
               <w:rPr>
@@ -5829,7 +5954,7 @@
                 <w:b w:val="0"/>
                 <w:i w:val="0"/>
               </w:rPr>
-              <w:t>1. 点击进入桌面或观看，核对实时在线、权限、网络可达性及占用；符合后显示连接中，避免重复发起。首帧可显示且会话可用才算连接成功。</w:t>
+              <w:t>1. 点击进入桌面或观看，核对实时在线、权限、网络可达性及占用；符合后显示连接中，避免重复发起。首帧可显示且会话可用才算连接成功。 /2026.10.28修改</w:t>
             </w:r>
             <w:r>
               <w:rPr>
@@ -5843,7 +5968,7 @@
                 <w:b w:val="0"/>
                 <w:i w:val="0"/>
               </w:rPr>
-              <w:t>2. 占用时确认接管才发起；取消不影响原会话。连接中取消回详情，失败/超时留在原流程，可检查设备后重试。跨网络不因非同一局域网而直接阻止；实际连接失败或超时保留原失败/重试路径，不显示连接成功。</w:t>
+              <w:t>2. 占用时确认接管才发起；取消不影响原会话。连接中取消回详情，失败/超时留在原流程，可检查设备后重试。跨网络不因非同一局域网而直接阻止；实际连接失败或超时保留原失败/重试路径，不显示连接成功。 /2026.10.28修改</w:t>
             </w:r>
             <w:r>
               <w:rPr>
@@ -6467,7 +6592,7 @@
                 <w:b w:val="0"/>
                 <w:i w:val="0"/>
               </w:rPr>
-              <w:t>1. 按设备隔离应用列表，手机一排四项、超出换行；游戏保留既有虚拟按键开关/布局，仅游戏已启动的远控会话支持横屏；其他页面保持竖屏；仅观看时隐藏可操作虚拟按键。</w:t>
+              <w:t>1. 按设备隔离应用列表，手机一排四项、超出换行；游戏保留既有虚拟按键开关/布局，仅游戏已启动的远控会话支持横屏；其他页面保持竖屏；仅观看时隐藏可操作虚拟按键。 /2026.10.28修改</w:t>
             </w:r>
             <w:r>
               <w:rPr>
@@ -7119,7 +7244,7 @@
                 <w:b w:val="0"/>
                 <w:i w:val="0"/>
               </w:rPr>
-              <w:t>1. 画面按原比例；竖屏16:9居中、上下留黑，不拉伸。仅当前为远控会话且游戏已启动时支持横屏适配；普通远控桌面及其他页面保持竖屏。</w:t>
+              <w:t>1. 画面按原比例；竖屏16:9居中、上下留黑，不拉伸。仅当前为远控会话且游戏已启动时支持横屏适配；普通远控桌面及其他页面保持竖屏。 /2026.10.28修改</w:t>
             </w:r>
             <w:r>
               <w:rPr>
@@ -7856,7 +7981,7 @@
                 <w:b w:val="0"/>
                 <w:i w:val="0"/>
               </w:rPr>
-              <w:t>1. 按截图保留排行、自定义、图标管理器等主页结构，标明复用盖世已有模块。</w:t>
+              <w:t>1. 按截图保留排行、自定义、图标管理器等主页结构，标明复用盖世已有模块。 /2026.10.28修改</w:t>
             </w:r>
             <w:r>
               <w:rPr>
@@ -7884,7 +8009,7 @@
                 <w:b w:val="0"/>
                 <w:i w:val="0"/>
               </w:rPr>
-              <w:t>1. 打开后可演示列表、搜索、详情、应用复制及既有编辑分享等交互；各级返回/关闭可用，不结束原会话。仅观看时不可写入或应用布局。</w:t>
+              <w:t>1. 打开后可演示列表、搜索、详情、应用复制及既有编辑分享等交互；各级返回/关闭可用，不结束原会话。仅观看时不可写入或应用布局。 /2026.10.28修改</w:t>
             </w:r>
           </w:p>
         </w:tc>
@@ -8818,7 +8943,7 @@
                 <w:b w:val="0"/>
                 <w:i w:val="0"/>
               </w:rPr>
-              <w:t>当前独立App盖世会话有效；头像、昵称和UID由当前盖世身份提供。</w:t>
+              <w:t>当前独立App盖世会话有效；头像、昵称和UID由当前盖世身份提供。 /2026.10.28修改</w:t>
             </w:r>
           </w:p>
         </w:tc>
@@ -9041,7 +9166,7 @@
                 <w:b w:val="0"/>
                 <w:i w:val="0"/>
               </w:rPr>
-              <w:t>1. 不显示顶部“我的”标题及其标题栏，右上保留扫一扫；账号区显示静态头像、昵称，下方显示当前盖世UID，退出图标紧挨昵称右侧，不放在整行最右端，不显示退出文字；图标按钮的aria-label和title均为“退出登录”。除退出按钮外，头像和账号资料静态展示，不显示右箭头，不作为按钮或入口。</w:t>
+              <w:t>1. 不显示顶部“我的”标题及其标题栏，右上保留扫一扫；账号区显示静态头像、昵称，下方显示当前盖世UID，退出图标紧挨昵称右侧，不放在整行最右端，不显示退出文字；图标按钮的aria-label和title均为“退出登录”。除退出按钮外，头像和账号资料静态展示，不显示右箭头，不作为按钮或入口。 /2026.10.28修改</w:t>
             </w:r>
             <w:r>
               <w:rPr>
@@ -9069,7 +9194,7 @@
                 <w:b w:val="0"/>
                 <w:i w:val="0"/>
               </w:rPr>
-              <w:t>3. 页面使用浅色样式，不提供风格、浅色模式或黑夜模式选项。Demo显示演示头像、昵称和“MVP 演示版”；正式账号资料与版本来自当前账号和安装包。新账号使用账号体系提供的默认头像/昵称；用户在盖世游戏修改后，本端重新获取账号资料时同步，不开放本端编辑。Demo的UID为按账号派生的稳定演示编号，同账号跨端一致；真实UID待账号服务接入。</w:t>
+              <w:t>3. 页面使用浅色样式，不提供风格、浅色模式或黑夜模式选项。Demo显示演示头像、昵称和“MVP 演示版”；正式账号资料与版本来自当前账号和安装包。新账号使用账号体系提供的默认头像/昵称；用户在盖世游戏修改后，本端重新获取账号资料时同步，不开放本端编辑。Demo的UID为按账号派生的稳定演示编号，同账号跨端一致；真实UID待账号服务接入。 /2026.10.28修改</w:t>
             </w:r>
             <w:r>
               <w:rPr>
@@ -10366,7 +10491,7 @@
                 <w:b w:val="0"/>
                 <w:i w:val="0"/>
               </w:rPr>
-              <w:t>1. 当前Demo为内置文章；正式内容采用静态H5，由运营提供并审核、服务端维护，客户端打开，更新文章不新增运营配置页。不新增反馈提交或客服流程。</w:t>
+              <w:t>1. 当前Demo为内置文章；正式内容采用静态H5，由运营提供并审核、服务端维护，客户端打开，更新文章不新增运营配置页。不新增反馈提交或客服流程。 /2026.10.28修改</w:t>
             </w:r>
           </w:p>
         </w:tc>
@@ -11142,7 +11267,7 @@
                 <w:b w:val="0"/>
                 <w:i w:val="0"/>
               </w:rPr>
-              <w:t>阅读用户协议、隐私协议及信息清单，提供账号注销入口。</w:t>
+              <w:t>阅读用户协议、隐私协议及信息清单，提供账号注销入口。 /2026.10.28修改</w:t>
             </w:r>
           </w:p>
         </w:tc>
@@ -11495,7 +11620,7 @@
                 <w:b w:val="0"/>
                 <w:i w:val="0"/>
               </w:rPr>
-              <w:t>1. 页面标题为“关于盖世远程”；显示用户协议、隐私协议、个人信息收集清单、第三方信息共享清单四项；仅登录时在其后显示“注销账号”。不放检查更新、当前版本、Logo或产品介绍。</w:t>
+              <w:t>1. 页面标题为“关于盖世远程”；显示用户协议、隐私协议、个人信息收集清单、第三方信息共享清单四项；仅登录时在其后显示“注销账号”。不放检查更新、当前版本、Logo或产品介绍。 /2026.10.28修改</w:t>
             </w:r>
             <w:r>
               <w:rPr>
@@ -11537,7 +11662,7 @@
                 <w:b w:val="0"/>
                 <w:i w:val="0"/>
               </w:rPr>
-              <w:t>2. 点击注销账号，正式版本打开盖世账号注销H5流程；当前无正式地址时在现有说明区域显示“注销账号页面待接入，正式版本将打开盖世账号注销流程。”，不跳虚构网址、不退出账号或模拟注销成功。</w:t>
+              <w:t>2. 点击注销账号，正式版本打开盖世账号注销H5流程；当前无正式地址时在现有说明区域显示“注销账号页面待接入，正式版本将打开盖世账号注销流程。”，不跳虚构网址、不退出账号或模拟注销成功。 /2026.10.28修改</w:t>
             </w:r>
           </w:p>
         </w:tc>
@@ -11602,7 +11727,7 @@
                 <w:b w:val="0"/>
                 <w:i w:val="0"/>
               </w:rPr>
-              <w:t>显示四项条款/清单及登录态下的注销入口；未接入时显示相应说明，不改变账号状态。</w:t>
+              <w:t>显示四项条款/清单及登录态下的注销入口；未接入时显示相应说明，不改变账号状态。 /2026.10.28修改</w:t>
             </w:r>
           </w:p>
         </w:tc>
@@ -11681,7 +11806,7 @@
                 <w:b w:val="0"/>
                 <w:i w:val="0"/>
               </w:rPr>
-              <w:t>2. 注销复用账号体系的既有H5，资格、确认步骤、生效及回传由该流程提供，不另拟规则；真实地址及结果衔接未接入前不宣称可完成注销。</w:t>
+              <w:t>2. 注销复用账号体系的既有H5，资格、确认步骤、生效及回传由该流程提供，不另拟规则；真实地址及结果衔接未接入前不宣称可完成注销。 /2026.10.28修改</w:t>
             </w:r>
           </w:p>
         </w:tc>
@@ -12570,7 +12695,7 @@
                 <w:b w:val="0"/>
                 <w:i w:val="0"/>
               </w:rPr>
-              <w:t>以可操作的灰色线框演示盖世已有“按键与布局”模块的入口、子流程与返回路径。</w:t>
+              <w:t>以可操作的灰色线框演示盖世已有“按键与布局”模块的入口、子流程与返回路径。 /2026.10.28修改</w:t>
             </w:r>
           </w:p>
         </w:tc>
@@ -12635,7 +12760,7 @@
                 <w:b w:val="0"/>
                 <w:i w:val="0"/>
               </w:rPr>
-              <w:t>移动端从原切换虚拟按键布局／映射方案入口打开。</w:t>
+              <w:t>移动端从原切换虚拟按键布局／映射方案入口打开。 /2026.10.28修改</w:t>
             </w:r>
           </w:p>
         </w:tc>
@@ -12700,7 +12825,7 @@
                 <w:b w:val="0"/>
                 <w:i w:val="0"/>
               </w:rPr>
-              <w:t>沿用原入口的登录与会话条件；写入和应用布局须处于可控制状态，仅观看不执行写操作。</w:t>
+              <w:t>沿用原入口的登录与会话条件；写入和应用布局须处于可控制状态，仅观看不执行写操作。 /2026.10.28修改</w:t>
             </w:r>
           </w:p>
         </w:tc>
@@ -12866,7 +12991,7 @@
                 <w:b w:val="0"/>
                 <w:i w:val="0"/>
               </w:rPr>
-              <w:t>1. 主页保持灰色线框，显示复用说明；上方保留“排行”“自定义”“图标管理器”和搜索，“适合当前游戏布局”为横向卡片，“全部布局”为双列卡片。</w:t>
+              <w:t>1. 主页保持灰色线框，显示复用说明；上方保留“排行”“自定义”“图标管理器”和搜索，“适合当前游戏布局”为横向卡片，“全部布局”为双列卡片。 /2026.10.28修改</w:t>
             </w:r>
             <w:r>
               <w:rPr>
@@ -12880,7 +13005,7 @@
                 <w:b w:val="0"/>
                 <w:i w:val="0"/>
               </w:rPr>
-              <w:t>2. “我的方案／我的云分享”仅在自定义二级页内展示，不替换为独立三Tab主页。列表、数量与云端内容为演示数据，不代表真实排行或生产服务。</w:t>
+              <w:t>2. “我的方案／我的云分享”仅在自定义二级页内展示，不替换为独立三Tab主页。列表、数量与云端内容为演示数据，不代表真实排行或生产服务。 /2026.10.28修改</w:t>
             </w:r>
             <w:r>
               <w:rPr>
@@ -12908,7 +13033,7 @@
                 <w:b w:val="0"/>
                 <w:i w:val="0"/>
               </w:rPr>
-              <w:t>1. 点击排行或当前游戏区域的更多，打开相应列表；搜索可进入匹配结果，点击任一卡片打开详情。</w:t>
+              <w:t>1. 点击排行或当前游戏区域的更多，打开相应列表；搜索可进入匹配结果，点击任一卡片打开详情。 /2026.10.28修改</w:t>
             </w:r>
             <w:r>
               <w:rPr>
@@ -12922,7 +13047,7 @@
                 <w:b w:val="0"/>
                 <w:i w:val="0"/>
               </w:rPr>
-              <w:t>2. 点击自定义进入我的方案/我的云分享；点击图标管理器进入图标列表。详情、编辑、应用、复制、发布、分享码导入和图标导入/删除均按下方既有功能闭环演示。</w:t>
+              <w:t>2. 点击自定义进入我的方案/我的云分享；点击图标管理器进入图标列表。详情、编辑、应用、复制、发布、分享码导入和图标导入/删除均按下方既有功能闭环演示。 /2026.10.28修改</w:t>
             </w:r>
             <w:r>
               <w:rPr>
@@ -12936,7 +13061,7 @@
                 <w:b w:val="0"/>
                 <w:i w:val="0"/>
               </w:rPr>
-              <w:t>3. 返回/Esc逐层退回来源；关闭整个模块回原会话，不退出账号或结束远控。编辑未保存时先处理保存、不保存或继续编辑；语言切换保留当前输入和业务状态。</w:t>
+              <w:t>3. 返回/Esc逐层退回来源；关闭整个模块回原会话，不退出账号或结束远控。编辑未保存时先处理保存、不保存或继续编辑；语言切换保留当前输入和业务状态。 /2026.10.28修改</w:t>
             </w:r>
           </w:p>
         </w:tc>
@@ -13001,7 +13126,7 @@
                 <w:b w:val="0"/>
                 <w:i w:val="0"/>
               </w:rPr>
-              <w:t>用户可完成所选既有交互的本地演示并返回原来源；演示成功只说明本次本地操作完成，不代表真实云同步或生产服务成功。</w:t>
+              <w:t>用户可完成所选既有交互的本地演示并返回原来源；演示成功只说明本次本地操作完成，不代表真实云同步或生产服务成功。 /2026.10.28修改</w:t>
             </w:r>
           </w:p>
         </w:tc>
@@ -13066,7 +13191,7 @@
                 <w:b w:val="0"/>
                 <w:i w:val="0"/>
               </w:rPr>
-              <w:t>1. 详情、编辑、云分享、分享码导入及图标管理复用盖世已有能力；本稿不重新规定名称字数、码位数、存储、覆盖、排序、复制或导入业务规则，正式接入沿用对应模块的有效规则。</w:t>
+              <w:t>1. 详情、编辑、云分享、分享码导入及图标管理复用盖世已有能力；本稿不重新规定名称字数、码位数、存储、覆盖、排序、复制或导入业务规则，正式接入沿用对应模块的有效规则。 /2026.10.28修改</w:t>
             </w:r>
             <w:r>
               <w:rPr>
@@ -13080,7 +13205,7 @@
                 <w:b w:val="0"/>
                 <w:i w:val="0"/>
               </w:rPr>
-              <w:t>2. 离开原会话、退出或切换账号后，旧编辑和异步结果不得写到其他账号或新会话。仅观看不写入或应用；失败/取消不显示成功，原有效数据保留。</w:t>
+              <w:t>2. 离开原会话、退出或切换账号后，旧编辑和异步结果不得写到其他账号或新会话。仅观看不写入或应用；失败/取消不显示成功，原有效数据保留。 /2026.10.28修改</w:t>
             </w:r>
             <w:r>
               <w:rPr>
@@ -13094,7 +13219,7 @@
                 <w:b w:val="0"/>
                 <w:i w:val="0"/>
               </w:rPr>
-              <w:t>3. 云分享目录只作本机模拟，真实云服务、审核及跨设备同步未接入。线框中的功能和按钮说明复用关系，不等于新建产品能力或真实服务已验收。</w:t>
+              <w:t>3. 云分享目录只作本机模拟，真实云服务、审核及跨设备同步未接入。线框中的功能和按钮说明复用关系，不等于新建产品能力或真实服务已验收。 /2026.10.28修改</w:t>
             </w:r>
           </w:p>
         </w:tc>
@@ -13393,7 +13518,7 @@
                 <w:b w:val="0"/>
                 <w:i w:val="0"/>
               </w:rPr>
-              <w:t>1. 展示当前来源的布局列表及可返回入口；搜索无匹配时显示无结果状态。</w:t>
+              <w:t>1. 展示当前来源的布局列表及可返回入口；搜索无匹配时显示无结果状态。 /2026.10.28修改</w:t>
             </w:r>
             <w:r>
               <w:rPr>
@@ -13421,7 +13546,7 @@
                 <w:b w:val="0"/>
                 <w:i w:val="0"/>
               </w:rPr>
-              <w:t>1. 点击排行/更多进入对应列表；搜索按已有模块的名称匹配逻辑更新结果，清空后恢复列表。点击卡片进入该方案详情，返回回到进入前的列表/搜索来源。搜索输入及排序沿用既有模块，不另定规则。</w:t>
+              <w:t>1. 点击排行/更多进入对应列表；搜索按已有模块的名称匹配逻辑更新结果，清空后恢复列表。点击卡片进入该方案详情，返回回到进入前的列表/搜索来源。搜索输入及排序沿用既有模块，不另定规则。 /2026.10.28修改</w:t>
             </w:r>
           </w:p>
         </w:tc>
@@ -13603,7 +13728,7 @@
                 <w:b w:val="0"/>
                 <w:i w:val="0"/>
               </w:rPr>
-              <w:t>1. 显示当前选中方案和已有可用操作，操作作用于该方案。</w:t>
+              <w:t>1. 显示当前选中方案和已有可用操作，操作作用于该方案。 /2026.10.28修改</w:t>
             </w:r>
             <w:r>
               <w:rPr>
@@ -13631,7 +13756,7 @@
                 <w:b w:val="0"/>
                 <w:i w:val="0"/>
               </w:rPr>
-              <w:t>1. 点击应用后，本地演示按所选方案更新当前选择并返回会话；点击复制保存为我的方案，取消复制不创建副本。</w:t>
+              <w:t>1. 点击应用后，本地演示按所选方案更新当前选择并返回会话；点击复制保存为我的方案，取消复制不创建副本。 /2026.10.28修改</w:t>
             </w:r>
             <w:r>
               <w:rPr>
@@ -13645,7 +13770,7 @@
                 <w:b w:val="0"/>
                 <w:i w:val="0"/>
               </w:rPr>
-              <w:t>2. 点击官方/他人方案的编辑，进入可保存为自己副本的编辑流程，不修改来源方案。返回回原列表，不自动应用。</w:t>
+              <w:t>2. 点击官方/他人方案的编辑，进入可保存为自己副本的编辑流程，不修改来源方案。返回回原列表，不自动应用。 /2026.10.28修改</w:t>
             </w:r>
           </w:p>
         </w:tc>
@@ -13827,7 +13952,7 @@
                 <w:b w:val="0"/>
                 <w:i w:val="0"/>
               </w:rPr>
-              <w:t>1. 二级页显示我的方案/我的云分享，内容按当前账号区分；未有数据时提供已有的新建或导入入口。</w:t>
+              <w:t>1. 二级页显示我的方案/我的云分享，内容按当前账号区分；未有数据时提供已有的新建或导入入口。 /2026.10.28修改</w:t>
             </w:r>
             <w:r>
               <w:rPr>
@@ -13855,7 +13980,7 @@
                 <w:b w:val="0"/>
                 <w:i w:val="0"/>
               </w:rPr>
-              <w:t>1. 切换查看本地方案或自己的模拟云分享；新建进入编辑，点已有方案可查看详情、编辑或复制；发布和分享码导入承接下方流程。返回回截图结构的主页，不替换主页导航。</w:t>
+              <w:t>1. 切换查看本地方案或自己的模拟云分享；新建进入编辑，点已有方案可查看详情、编辑或复制；发布和分享码导入承接下方流程。返回回截图结构的主页，不替换主页导航。 /2026.10.28修改</w:t>
             </w:r>
           </w:p>
         </w:tc>
@@ -14037,7 +14162,7 @@
                 <w:b w:val="0"/>
                 <w:i w:val="0"/>
               </w:rPr>
-              <w:t>1. 显示当前方案按键、位置及已有编辑控件；名称、类型和内容校验沿用原模块。</w:t>
+              <w:t>1. 显示当前方案按键、位置及已有编辑控件；名称、类型和内容校验沿用原模块。 /2026.10.28修改</w:t>
             </w:r>
             <w:r>
               <w:rPr>
@@ -14065,7 +14190,7 @@
                 <w:b w:val="0"/>
                 <w:i w:val="0"/>
               </w:rPr>
-              <w:t>1. 拖动按键改变位置，添加/删除改变当前编辑内容；保存成功后显示对应本地/云方案，实际修改随方案保存，不只显示成功提示。</w:t>
+              <w:t>1. 拖动按键改变位置，添加/删除改变当前编辑内容；保存成功后显示对应本地/云方案，实际修改随方案保存，不只显示成功提示。 /2026.10.28修改</w:t>
             </w:r>
             <w:r>
               <w:rPr>
@@ -14079,7 +14204,7 @@
                 <w:b w:val="0"/>
                 <w:i w:val="0"/>
               </w:rPr>
-              <w:t>2. 有未保存修改时，返回/Esc按已有提示提供保存、不保存、继续编辑；不保存丢弃本次修改，继续编辑保留草稿，取消不退出远控。</w:t>
+              <w:t>2. 有未保存修改时，返回/Esc按已有提示提供保存、不保存、继续编辑；不保存丢弃本次修改，继续编辑保留草稿，取消不退出远控。 /2026.10.28修改</w:t>
             </w:r>
           </w:p>
         </w:tc>
@@ -14261,7 +14386,7 @@
                 <w:b w:val="0"/>
                 <w:i w:val="0"/>
               </w:rPr>
-              <w:t>1. 复用既有发布表单与分享码界面；名称、码格式及更新规则由原模块提供，本稿不另定。</w:t>
+              <w:t>1. 复用既有发布表单与分享码界面；名称、码格式及更新规则由原模块提供，本稿不另定。 /2026.10.28修改</w:t>
             </w:r>
             <w:r>
               <w:rPr>
@@ -14289,7 +14414,7 @@
                 <w:b w:val="0"/>
                 <w:i w:val="0"/>
               </w:rPr>
-              <w:t>1. 从我的方案确认发布后更新本机模拟云目录，并展示本次分享码；取消不发布。点击复制按剪贴板实际结果反馈，失败可手动复制，不伪报成功。</w:t>
+              <w:t>1. 从我的方案确认发布后更新本机模拟云目录，并展示本次分享码；取消不发布。点击复制按剪贴板实际结果反馈，失败可手动复制，不伪报成功。 /2026.10.28修改</w:t>
             </w:r>
             <w:r>
               <w:rPr>
@@ -14303,7 +14428,7 @@
                 <w:b w:val="0"/>
                 <w:i w:val="0"/>
               </w:rPr>
-              <w:t>2. 输入可获取的有效分享码后，导入自己的方案并直接进入编辑；无效码显示原错误提示，不产生成功副本。各弹窗关闭回原来源，不重新登录或连接。</w:t>
+              <w:t>2. 输入可获取的有效分享码后，导入自己的方案并直接进入编辑；无效码显示原错误提示，不产生成功副本。各弹窗关闭回原来源，不重新登录或连接。 /2026.10.28修改</w:t>
             </w:r>
           </w:p>
         </w:tc>
@@ -14485,7 +14610,7 @@
                 <w:b w:val="0"/>
                 <w:i w:val="0"/>
               </w:rPr>
-              <w:t>1. 显示已有图标及当前账号导入的本地图标；导入成功后展示所选图片的实际预览。</w:t>
+              <w:t>1. 显示已有图标及当前账号导入的本地图标；导入成功后展示所选图片的实际预览。 /2026.10.28修改</w:t>
             </w:r>
             <w:r>
               <w:rPr>
@@ -14513,7 +14638,7 @@
                 <w:b w:val="0"/>
                 <w:i w:val="0"/>
               </w:rPr>
-              <w:t>1. 点击导入打开本地文件选择；取消选择不改列表，读取/校验成功才增加图标，失败保留原列表并说明失败。格式与大小等规则沿既有模块，不另定产品限制。</w:t>
+              <w:t>1. 点击导入打开本地文件选择；取消选择不改列表，读取/校验成功才增加图标，失败保留原列表并说明失败。格式与大小等规则沿既有模块，不另定产品限制。 /2026.10.28修改</w:t>
             </w:r>
             <w:r>
               <w:rPr>
@@ -14527,7 +14652,7 @@
                 <w:b w:val="0"/>
                 <w:i w:val="0"/>
               </w:rPr>
-              <w:t>2. 删除需确认，取消保留图标，确认后移除该图标；返回回模块主页。上述操作只影响本地演示，不宣称图片已上传云端。</w:t>
+              <w:t>2. 删除需确认，取消保留图标，确认后移除该图标；返回回模块主页。上述操作只影响本地演示，不宣称图片已上传云端。 /2026.10.28修改</w:t>
             </w:r>
           </w:p>
         </w:tc>
@@ -15110,7 +15235,7 @@
                 <w:b w:val="0"/>
                 <w:i w:val="0"/>
               </w:rPr>
-              <w:t>1. 未登录启动或退出账号后直接展示完整登录页，不再先显示独立欢迎首页或要求点击登录后展开表单。品牌区只盖世游戏Logo和“盖世远程”，无电脑插画、宣传标题/副文案。左侧显示“App扫码登录”及电脑登录二维码，说明“使用盖世远程或盖世游戏App扫码登录”，右侧国内手机号验证码；海外邮箱验证码及Google，不显示账号密码/微信/QQ。未登录时右上不显示账户和更多。</w:t>
+              <w:t>1. 未登录启动或退出账号后直接展示完整登录页，不再先显示独立欢迎首页或要求点击登录后展开表单。品牌区只盖世游戏Logo和“盖世远程”，无电脑插画、宣传标题/副文案。左侧显示“App扫码登录”及电脑登录二维码，说明“使用盖世远程或盖世游戏App扫码登录”，右侧国内手机号验证码；海外邮箱验证码及Google，不显示账号密码/微信/QQ。未登录时右上不显示账户和更多。 /2026.10.28修改</w:t>
             </w:r>
             <w:r>
               <w:rPr>
@@ -15124,7 +15249,7 @@
                 <w:b w:val="0"/>
                 <w:i w:val="0"/>
               </w:rPr>
-              <w:t>2. 底部统一协议默认未勾选：国内用户/隐私/中国移动认证三项，海外用户/隐私两项。未同意时仍展示可扫描的登录码，允许进入手机确认页；表单、获取验证码及登录/Google入口不因未勾选而禁用。扫码本身不代表确认或登录成功。盖世游戏下载链接仍可打开对应官网，不作为唯一扫码来源。</w:t>
+              <w:t>2. 底部统一协议默认未勾选：国内用户/隐私/中国移动认证三项，海外用户/隐私两项。未同意时仍展示可扫描的登录码，允许进入手机确认页；表单、获取验证码及登录/Google入口不因未勾选而禁用。扫码本身不代表确认或登录成功。盖世游戏下载链接仍可打开对应官网，不作为唯一扫码来源。 /2026.10.28修改</w:t>
             </w:r>
             <w:r>
               <w:rPr>
@@ -15166,7 +15291,7 @@
                 <w:b w:val="0"/>
                 <w:i w:val="0"/>
               </w:rPr>
-              <w:t>2. 国内Demo为+86、11位手机号；海外邮箱最多254字符，去首尾空格后校验格式；验证码最多6位数字。空值/格式错不发送、不提交；未发送、错误或失效不登录。统一演示使用国内手机号13600008000或海外邮箱player@example.com，先获取验证码、填写123456、勾选协议再登录；不发送短信邮件，符合当前格式的其他手机号/邮箱也可模拟登录，不设账号白名单。Mac既有sr-fill填入的13800138000/demo@gamehub.test同样可用。正式规则复用盖世组件并核对。</w:t>
+              <w:t>2. 国内Demo为+86、11位手机号；海外邮箱最多254字符，去首尾空格后校验格式；验证码最多6位数字。空值/格式错不发送、不提交；未发送、错误或失效不登录。统一演示使用国内手机号13600008000或海外邮箱player@example.com，先获取验证码、填写123456、勾选协议再登录；不发送短信邮件，符合当前格式的其他手机号/邮箱也可模拟登录，不设账号白名单。Mac既有sr-fill填入的13800138000/demo@gamehub.test同样可用。正式规则复用盖世组件并核对。 /2026.10.28修改</w:t>
             </w:r>
             <w:r>
               <w:rPr>
@@ -15180,7 +15305,7 @@
                 <w:b w:val="0"/>
                 <w:i w:val="0"/>
               </w:rPr>
-              <w:t>3. 初始登录码绑定本发起端，未同意也可扫描至待确认；勾选同意保留仍有效的同一码、扫码状态、输入及验证码，更新本次同意状态，无需重扫或重取验证码。撤勾使旧码和请求失效，生成新的可扫描但未同意的码，旧扫码确认不能复用。支持已登录盖世远程App的我的→扫一扫，或盖世游戏App扫码后确认；两者确认的均为本次电脑登录。真实码协议、支持版本和跨App联调仍需接入，Demo不证明生产扫码兼容。二维码不是设备被控码，不继承Steam/Epic会话。</w:t>
+              <w:t>3. 初始登录码绑定本发起端，未同意也可扫描至待确认；勾选同意保留仍有效的同一码、扫码状态、输入及验证码，更新本次同意状态，无需重扫或重取验证码。撤勾使旧码和请求失效，生成新的可扫描但未同意的码，旧扫码确认不能复用。支持已登录盖世远程App的我的→扫一扫，或盖世游戏App扫码后确认；两者确认的均为本次电脑登录。真实码协议、支持版本和跨App联调仍需接入，Demo不证明生产扫码兼容。二维码不是设备被控码，不继承Steam/Epic会话。 /2026.10.28修改</w:t>
             </w:r>
             <w:r>
               <w:rPr>
@@ -15194,7 +15319,7 @@
                 <w:b w:val="0"/>
                 <w:i w:val="0"/>
               </w:rPr>
-              <w:t>4. Google仅海外，同意后走渠道原授权，不收集Google密码；验证码、Google和扫码在最终异步完成/领取前均复核本次协议同意和请求有效性，首次使用且无既有账号时按盖世账号体系完成登录即注册；取得有效会话后才获取当前UID工作区。</w:t>
+              <w:t>4. Google仅海外，同意后走渠道原授权，不收集Google密码；验证码、Google和扫码在最终异步完成/领取前均复核本次协议同意和请求有效性，首次使用且无既有账号时按盖世账号体系完成登录即注册；取得有效会话后才获取当前UID工作区。 /2026.10.28修改</w:t>
             </w:r>
             <w:r>
               <w:rPr>
@@ -16596,7 +16721,7 @@
                 <w:b w:val="0"/>
                 <w:i w:val="0"/>
               </w:rPr>
-              <w:t>2. 不展示远程协助、设备码、收藏或会员；不承诺公网必定连接成功或未确定的画质、时长。</w:t>
+              <w:t>2. 不展示远程协助、设备码、收藏或会员；不承诺公网必定连接成功或未确定的画质、时长。 /2026.10.28修改</w:t>
             </w:r>
             <w:r>
               <w:rPr>
@@ -17994,7 +18119,7 @@
                 <w:b w:val="0"/>
                 <w:i w:val="0"/>
               </w:rPr>
-              <w:t>1. 点击进入桌面或观看，核对实时在线、权限、网络可达性及占用；符合后显示连接中，避免重复发起。首帧可显示且会话可用才算连接成功。</w:t>
+              <w:t>1. 点击进入桌面或观看，核对实时在线、权限、网络可达性及占用；符合后显示连接中，避免重复发起。首帧可显示且会话可用才算连接成功。 /2026.10.28修改</w:t>
             </w:r>
             <w:r>
               <w:rPr>
@@ -18008,7 +18133,7 @@
                 <w:b w:val="0"/>
                 <w:i w:val="0"/>
               </w:rPr>
-              <w:t>2. 占用时确认接管才发起；取消不影响原会话。连接中取消回详情，失败/超时留在原流程，可检查设备后重试。跨网络不因非同一局域网而直接阻止；实际连接失败或超时保留原失败/重试路径，不显示连接成功。</w:t>
+              <w:t>2. 占用时确认接管才发起；取消不影响原会话。连接中取消回详情，失败/超时留在原流程，可检查设备后重试。跨网络不因非同一局域网而直接阻止；实际连接失败或超时保留原失败/重试路径，不显示连接成功。 /2026.10.28修改</w:t>
             </w:r>
             <w:r>
               <w:rPr>
@@ -18152,7 +18277,7 @@
                 <w:b w:val="0"/>
                 <w:i w:val="0"/>
               </w:rPr>
-              <w:t>1. 主控登录不能代替目标系统授权；公网与局域网均需目标在线、网络可达及权限有效。失败、取消、离线或权限不足留在原设备流程，不显示成功桌面。</w:t>
+              <w:t>1. 主控登录不能代替目标系统授权；公网与局域网均需目标在线、网络可达及权限有效。失败、取消、离线或权限不足留在原设备流程，不显示成功桌面。 /2026.10.28修改</w:t>
             </w:r>
             <w:r>
               <w:rPr>
@@ -21418,7 +21543,7 @@
                 <w:b w:val="0"/>
                 <w:i w:val="0"/>
               </w:rPr>
-              <w:t>3. 账户面板显示静态头像、当前昵称，下方显示当前盖世UID，昵称右侧只显示退出图标，不显示退出文字；图标按钮的aria-label和title均为“退出登录”，不在面板底部重复放退出入口。头像不显示可点击反馈；当前Demo用演示头像，正式资料由盖世账号体系提供；新账号使用其默认头像/昵称，盖世侧修改后本端重新获取资料时同步，不开放本端编辑。Demo按账号派生稳定的演示UID，同账号跨端一致，不冒充服务端真实UID。</w:t>
+              <w:t>3. 账户面板显示静态头像、当前昵称，下方显示当前盖世UID，昵称右侧只显示退出图标，不显示退出文字；图标按钮的aria-label和title均为“退出登录”，不在面板底部重复放退出入口。头像不显示可点击反馈；当前Demo用演示头像，正式资料由盖世账号体系提供；新账号使用其默认头像/昵称，盖世侧修改后本端重新获取资料时同步，不开放本端编辑。Demo按账号派生稳定的演示UID，同账号跨端一致，不冒充服务端真实UID。 /2026.10.28修改</w:t>
             </w:r>
             <w:r>
               <w:rPr>
@@ -22868,7 +22993,7 @@
                 <w:b w:val="0"/>
                 <w:i w:val="0"/>
               </w:rPr>
-              <w:t>1. 正式帮助内容采用静态H5，由运营提供并审核、服务端维护，客户端打开；一期不新增运营配置页、客服或反馈提交流程。</w:t>
+              <w:t>1. 正式帮助内容采用静态H5，由运营提供并审核、服务端维护，客户端打开；一期不新增运营配置页、客服或反馈提交流程。 /2026.10.28修改</w:t>
             </w:r>
           </w:p>
         </w:tc>
@@ -23644,7 +23769,7 @@
                 <w:b w:val="0"/>
                 <w:i w:val="0"/>
               </w:rPr>
-              <w:t>阅读电脑客户端协议与信息清单，提供账号注销入口。</w:t>
+              <w:t>阅读电脑客户端协议与信息清单，提供账号注销入口。 /2026.10.28修改</w:t>
             </w:r>
           </w:p>
         </w:tc>
@@ -23940,7 +24065,7 @@
                 <w:b w:val="0"/>
                 <w:i w:val="0"/>
               </w:rPr>
-              <w:t>1. 标题为“关于盖世远程”；显示用户协议、隐私协议、个人信息收集清单、第三方信息共享清单；仅登录时在列表后显示“注销账号”。不放检查更新、版本、Logo或产品介绍。</w:t>
+              <w:t>1. 标题为“关于盖世远程”；显示用户协议、隐私协议、个人信息收集清单、第三方信息共享清单；仅登录时在列表后显示“注销账号”。不放检查更新、版本、Logo或产品介绍。 /2026.10.28修改</w:t>
             </w:r>
             <w:r>
               <w:rPr>
@@ -23982,7 +24107,7 @@
                 <w:b w:val="0"/>
                 <w:i w:val="0"/>
               </w:rPr>
-              <w:t>2. 点击注销账号，正式版本打开盖世账号注销H5流程；当前无正式地址时在现有说明区域显示“注销账号页面待接入，正式版本将打开盖世账号注销流程。”，不跳虚构网址、不退出账号或模拟注销成功。</w:t>
+              <w:t>2. 点击注销账号，正式版本打开盖世账号注销H5流程；当前无正式地址时在现有说明区域显示“注销账号页面待接入，正式版本将打开盖世账号注销流程。”，不跳虚构网址、不退出账号或模拟注销成功。 /2026.10.28修改</w:t>
             </w:r>
           </w:p>
         </w:tc>
@@ -24047,7 +24172,7 @@
                 <w:b w:val="0"/>
                 <w:i w:val="0"/>
               </w:rPr>
-              <w:t>显示四项条款/清单及登录态下的注销入口；未接入时显示相应说明，不改变账号状态。</w:t>
+              <w:t>显示四项条款/清单及登录态下的注销入口；未接入时显示相应说明，不改变账号状态。 /2026.10.28修改</w:t>
             </w:r>
           </w:p>
         </w:tc>
@@ -24126,7 +24251,7 @@
                 <w:b w:val="0"/>
                 <w:i w:val="0"/>
               </w:rPr>
-              <w:t>2. 注销复用账号体系的既有H5，资格、确认步骤、生效及回传由该流程提供，不另拟规则；真实地址及结果衔接未接入前不宣称可完成注销。</w:t>
+              <w:t>2. 注销复用账号体系的既有H5，资格、确认步骤、生效及回传由该流程提供，不另拟规则；真实地址及结果衔接未接入前不宣称可完成注销。 /2026.10.28修改</w:t>
             </w:r>
           </w:p>
         </w:tc>
@@ -24189,7 +24314,7 @@
           <w:b w:val="0"/>
           <w:i w:val="0"/>
         </w:rPr>
-        <w:t>本轮我的/帮助搜索/版本/关于为页面与入口调整，不新增统计目标或埋点；扫码继续归入电脑端登录尝试，不将手机扫描或确认记作登录成功。埋点先保留当前事件设计；接入新自有平台或Firebase的选择、接口和迁移口径待数据团队确认，不同时重复计数。按键与布局本轮提供可操作的复用交互线框，Demo不向生产上报业务事件；正式接入盖世已有模块时沿用其有效事件与数据口径，具体映射需核对，本地演示成功不能作为真实云服务成功。以下三项为既有独立登录改造的新增事件；每项包含登录业务参数及产品归属。账号、事件ID、客户端版本、环境等SDK公参复用原字典，接入前核对映射。</w:t>
+        <w:t>本轮我的/帮助搜索/版本/关于为页面与入口调整，不新增统计目标或埋点；扫码继续归入电脑端登录尝试，不将手机扫描或确认记作登录成功。埋点先保留当前事件设计；接入新自有平台或Firebase的选择、接口和迁移口径待数据团队确认，不同时重复计数。按键与布局本轮提供可操作的复用交互线框，Demo不向生产上报业务事件；正式接入盖世已有模块时沿用其有效事件与数据口径，具体映射需核对，本地演示成功不能作为真实云服务成功。以下三项为既有独立登录改造的新增事件；每项包含登录业务参数及产品归属。账号、事件ID、客户端版本、环境等SDK公参复用原字典，接入前核对映射。 /2026.10.28修改</w:t>
       </w:r>
     </w:p>
     <w:p>
@@ -25089,7 +25214,7 @@
           <w:b w:val="0"/>
           <w:i w:val="0"/>
         </w:rPr>
-        <w:t>。独立版使用新的产品归属区分历史数据，不重写历史事件含义。 本轮公网纳入一期后，连接事件不再继承旧稿“仅上报network_scope=lan”或“非LAN即not_same_lan拦截”的规则；网络范围按真实连接来源记录，公网取值及历史兼容映射由数据团队确认，未确认前不得伪报lan或连接成功。该变更不放宽Windows远程唤醒原有的目标系统、网络及辅助设备条件。</w:t>
+        <w:t>。独立版使用新的产品归属区分历史数据，不重写历史事件含义。 本轮公网纳入一期后，连接事件不再继承旧稿“仅上报network_scope=lan”或“非LAN即not_same_lan拦截”的规则；网络范围按真实连接来源记录，公网取值及历史兼容映射由数据团队确认，未确认前不得伪报lan或连接成功。该变更不放宽Windows远程唤醒原有的目标系统、网络及辅助设备条件。 /2026.10.28修改</w:t>
       </w:r>
     </w:p>
     <w:p>
@@ -26148,7 +26273,7 @@
           <w:b w:val="0"/>
           <w:i w:val="0"/>
         </w:rPr>
-        <w:t>两端以同一服务端UID识别盖世共用账号，独立产品各自建立会话；首次登录即注册，生成的账号可在盖世游戏使用。头像昵称及UID从同一账号体系获取，本端只展示。扫码及跨 App 登录必须绑定本次发起端；取消、过期或刷新后旧授权不可继续使用。跨 App 返回需要恢复发起端页面；会话未核实前不读取设备。账号服务异常时保留仍可用的本地区登录方式，具体 SDK、授权回调和会话撤销方案由账号团队与客户端核对。</w:t>
+        <w:t>两端以同一服务端UID识别盖世共用账号，独立产品各自建立会话；首次登录即注册，生成的账号可在盖世游戏使用。头像昵称及UID从同一账号体系获取，本端只展示。扫码及跨 App 登录必须绑定本次发起端；取消、过期或刷新后旧授权不可继续使用。跨 App 返回需要恢复发起端页面；会话未核实前不读取设备。账号服务异常时保留仍可用的本地区登录方式，具体 SDK、授权回调和会话撤销方案由账号团队与客户端核对。 /2026.10.28修改</w:t>
       </w:r>
     </w:p>
     <w:p>
@@ -26172,7 +26297,7 @@
           <w:b w:val="0"/>
           <w:i w:val="0"/>
         </w:rPr>
-        <w:t>未改远控区域的精确参数及旧交互以V3.10 §3.1.3～3.1.7a、§3.1.10～3.1.16及对应当前模块为基线，按键与布局本轮按3.1.12演示可操作的复用线框，不改变盖世已有模块的业务规则；本稿已替换其嵌入式入口、登录前置和仅局域网范围，不继承游戏库/商店外壳，也不将模拟内容视为真实服务。</w:t>
+        <w:t>未改远控区域的精确参数及旧交互以V3.10 §3.1.3～3.1.7a、§3.1.10～3.1.16及对应当前模块为基线，按键与布局本轮按3.1.12演示可操作的复用线框，不改变盖世已有模块的业务规则；本稿已替换其嵌入式入口、登录前置和仅局域网范围，不继承游戏库/商店外壳，也不将模拟内容视为真实服务。 /2026.10.28修改</w:t>
       </w:r>
     </w:p>
     <w:p>
@@ -26390,7 +26515,7 @@
                 <w:b w:val="0"/>
                 <w:i w:val="0"/>
               </w:rPr>
-              <w:t>一期提供中文、英文，语言随官网下载的对应安装包确定，正式客户端不设语言切换。官网露出盖世远程Android、iOS、Windows、Mac下载入口并关联对应语言包；实际可下载平台、版本、架构和包地址待确认，不放虚构下载地址。</w:t>
+              <w:t>一期提供中文、英文，语言随官网下载的对应安装包确定，正式客户端不设语言切换。官网露出盖世远程Android、iOS、Windows、Mac下载入口并关联对应语言包；实际可下载平台、版本、架构和包地址待确认，不放虚构下载地址。 /2026.10.28修改</w:t>
             </w:r>
           </w:p>
         </w:tc>
@@ -26455,7 +26580,7 @@
                 <w:b w:val="0"/>
                 <w:i w:val="0"/>
               </w:rPr>
-              <w:t>双端Demo顶部外部评审区常驻“中文”“English”按钮，点击即时切换当前界面文案并记忆选择，刷新或再次打开沿用已选语言。语言与国内/海外地区独立：国内继续手机号渠道，海外继续邮箱/Google，扫码及盖世授权规则不变；切换语言不改输入、协议勾选、账号登录态、当前页面、请求/验证码/二维码和进行中任务，不重新发起或作废请求。按钮不是正式产品地区入口，不新增设置页。本文界面文案以中文为例，英文提供对应含义；用户输入、手机号、邮箱、验证码及业务标识不随语言改写。</w:t>
+              <w:t>双端Demo顶部外部评审区常驻“中文”“English”按钮，点击即时切换当前界面文案并记忆选择，刷新或再次打开沿用已选语言。语言与国内/海外地区独立：国内继续手机号渠道，海外继续邮箱/Google，扫码及盖世授权规则不变；切换语言不改输入、协议勾选、账号登录态、当前页面、请求/验证码/二维码和进行中任务，不重新发起或作废请求。按钮不是正式产品地区入口，不新增设置页。本文界面文案以中文为例，英文提供对应含义；用户输入、手机号、邮箱、验证码及业务标识不随语言改写。 /2026.10.28修改</w:t>
             </w:r>
           </w:p>
         </w:tc>
@@ -26520,7 +26645,7 @@
                 <w:b w:val="0"/>
                 <w:i w:val="0"/>
               </w:rPr>
-              <w:t>帮助与协议采用静态H5，运营提供内容、服务端维护，客户端提供入口；一期不建文章/协议后台配置页。协议按盖世远程实际功能、采集信息及已接入SDK整理并经法务审核，不直接改产品名后沿用无关条款；主体、版本、正式地址及中国移动实际认证方式待核对。未提供正文时Demo仅显示待接入预览，不新增运营商一键登录能力。</w:t>
+              <w:t>帮助与协议采用静态H5，运营提供内容、服务端维护，客户端提供入口；一期不建文章/协议后台配置页。协议按盖世远程实际功能、采集信息及已接入SDK整理并经法务审核，不直接改产品名后沿用无关条款；主体、版本、正式地址及中国移动实际认证方式待核对。未提供正文时Demo仅显示待接入预览，不新增运营商一键登录能力。 /2026.10.28修改</w:t>
             </w:r>
           </w:p>
         </w:tc>
@@ -26585,7 +26710,7 @@
                 <w:b w:val="0"/>
                 <w:i w:val="0"/>
               </w:rPr>
-              <w:t>安装包保留渠道标识，检查更新沿用盖世的官网/应用商店分渠道规则；独立产品更新源与盖世游戏配置分开，后台账号权限可复用。正式版本、下载地址、商店跳转及失败恢复按适用渠道接入，Demo仅模拟检测和下载结果。</w:t>
+              <w:t>安装包保留渠道标识，检查更新沿用盖世的官网/应用商店分渠道规则；独立产品更新源与盖世游戏配置分开，后台账号权限可复用。正式版本、下载地址、商店跳转及失败恢复按适用渠道接入，Demo仅模拟检测和下载结果。 /2026.10.28修改</w:t>
             </w:r>
           </w:p>
         </w:tc>
@@ -26650,7 +26775,7 @@
                 <w:b w:val="0"/>
                 <w:i w:val="0"/>
               </w:rPr>
-              <w:t>一期支持公网与局域网；打洞/转发策略、自研或供应商、成本及容量须进一步评估。收费、免费画质、时长与用户限量尚未定案，界面不新增套餐、限额或免费承诺。实际网络不可达、服务失败或超时不标连接成功。</w:t>
+              <w:t>一期支持公网与局域网；打洞/转发策略、自研或供应商、成本及容量须进一步评估。收费、免费画质、时长与用户限量尚未定案，界面不新增套餐、限额或免费承诺。实际网络不可达、服务失败或超时不标连接成功。 /2026.10.28修改</w:t>
             </w:r>
           </w:p>
         </w:tc>
@@ -26715,7 +26840,7 @@
                 <w:b w:val="0"/>
                 <w:i w:val="0"/>
               </w:rPr>
-              <w:t>独立应用需准备软著、ICP、签名、商店应用及实际功能匹配的协议/采集和共享清单；正式资料经相应审核后接入。先准备本地最小可运行包用于软著材料，不改变一期包含公网的产品范围，不将会议口头日期写成发版承诺。</w:t>
+              <w:t>独立应用需准备软著、ICP、签名、商店应用及实际功能匹配的协议/采集和共享清单；正式资料经相应审核后接入。先准备本地最小可运行包用于软著材料，不改变一期包含公网的产品范围，不将会议口头日期写成发版承诺。 /2026.10.28修改</w:t>
             </w:r>
           </w:p>
         </w:tc>
@@ -27065,7 +27190,7 @@
                 <w:b w:val="0"/>
                 <w:i w:val="0"/>
               </w:rPr>
-              <w:t>阻塞入口及公网埋点联调，不阻塞页面。</w:t>
+              <w:t>阻塞入口及公网埋点联调，不阻塞页面。 /2026.10.28修改</w:t>
             </w:r>
           </w:p>
         </w:tc>
@@ -27940,7 +28065,7 @@
                 <w:b w:val="0"/>
                 <w:i w:val="0"/>
               </w:rPr>
-              <w:t>阻塞真实公网服务与资源规则验收，不影响已确认的一期公网范围；Demo不证明服务已接通。</w:t>
+              <w:t>阻塞真实公网服务与资源规则验收，不影响已确认的一期公网范围；Demo不证明服务已接通。 /2026.10.28修改</w:t>
             </w:r>
           </w:p>
         </w:tc>
@@ -28190,7 +28315,7 @@
                 <w:b w:val="0"/>
                 <w:i w:val="0"/>
               </w:rPr>
-              <w:t>本轮交付可操作的本地复用演示，未代表真实模块或云分享服务接入完成。</w:t>
+              <w:t>本轮交付可操作的本地复用演示，未代表真实模块或云分享服务接入完成。 /2026.10.28修改</w:t>
             </w:r>
           </w:p>
         </w:tc>
@@ -28315,7 +28440,7 @@
                 <w:b w:val="0"/>
                 <w:i w:val="0"/>
               </w:rPr>
-              <w:t>阻塞真实注销联调，不阻塞待接入入口展示；不以点击入口判注销成功。</w:t>
+              <w:t>阻塞真实注销联调，不阻塞待接入入口展示；不以点击入口判注销成功。 /2026.10.28修改</w:t>
             </w:r>
           </w:p>
         </w:tc>

</xml_diff>